<commit_message>
Resume: Cyber Security Analyst @ Societe Generale Global Solution Centre (MNC)
</commit_message>
<xml_diff>
--- a/resumes/Resume_Cyber_Security_Analyst_Societe_Generale_Global_Solution_Ce.docx
+++ b/resumes/Resume_Cyber_Security_Analyst_Societe_Generale_Global_Solution_Ce.docx
@@ -4,7 +4,7 @@
   <w:body>
     <w:p>
       <w:pPr>
-        <w:spacing w:after="44"/>
+        <w:spacing w:after="0" w:before="20"/>
         <w:jc w:val="center"/>
       </w:pPr>
       <w:r>
@@ -21,6 +21,7 @@
     </w:p>
     <w:p>
       <w:pPr>
+        <w:spacing w:before="20" w:after="0"/>
         <w:jc w:val="center"/>
       </w:pPr>
       <w:r>
@@ -116,7 +117,7 @@
         <w:pBdr>
           <w:bottom w:val="single" w:sz="6" w:space="1" w:color="000000"/>
         </w:pBdr>
-        <w:spacing w:before="360" w:after="52"/>
+        <w:spacing w:before="113" w:after="0"/>
       </w:pPr>
       <w:r>
         <w:rPr>
@@ -127,12 +128,48 @@
           <w:sz w:val="22"/>
           <w:szCs w:val="22"/>
         </w:rPr>
-        <w:t>Professional Summary</w:t>
-      </w:r>
-    </w:p>
-    <w:p>
-      <w:pPr>
-        <w:spacing w:before="8"/>
+        <w:t>Education</w:t>
+      </w:r>
+    </w:p>
+    <w:p>
+      <w:pPr>
+        <w:tabs>
+          <w:tab w:val="right" w:pos="10800"/>
+        </w:tabs>
+        <w:spacing w:before="20" w:after="0"/>
+      </w:pPr>
+      <w:r>
+        <w:rPr>
+          <w:rFonts w:ascii="Source Sans Pro" w:eastAsia="Source Sans Pro" w:hAnsi="Source Sans Pro" w:cs="Source Sans Pro"/>
+          <w:b/>
+          <w:bCs/>
+          <w:color w:val="000000"/>
+          <w:sz w:val="19"/>
+          <w:szCs w:val="19"/>
+        </w:rPr>
+        <w:t>Presidency College</w:t>
+      </w:r>
+      <w:r>
+        <w:rPr>
+          <w:rFonts w:ascii="Source Sans Pro" w:eastAsia="Source Sans Pro" w:hAnsi="Source Sans Pro" w:cs="Source Sans Pro"/>
+          <w:sz w:val="19"/>
+          <w:szCs w:val="19"/>
+        </w:rPr>
+        <w:tab/>
+      </w:r>
+      <w:r>
+        <w:rPr>
+          <w:rFonts w:ascii="Source Sans Pro" w:eastAsia="Source Sans Pro" w:hAnsi="Source Sans Pro" w:cs="Source Sans Pro"/>
+          <w:color w:val="555555"/>
+          <w:sz w:val="19"/>
+          <w:szCs w:val="19"/>
+        </w:rPr>
+        <w:t>2021 – 2023</w:t>
+      </w:r>
+    </w:p>
+    <w:p>
+      <w:pPr>
+        <w:spacing w:before="8" w:after="0"/>
       </w:pPr>
       <w:r>
         <w:rPr>
@@ -143,26 +180,7 @@
           <w:sz w:val="17"/>
           <w:szCs w:val="17"/>
         </w:rPr>
-        <w:t>Entry-level cybersecurity professional with hands-on experience in Python, Linux, Splunk, and Wireshark. Utilized top skills in threat detection, risk analysis, and compliance monitoring. Demonstrated expertise in TCP/IP, DNS, and AWS basics, with a strong understanding of root cause analysis and audit documentation.</w:t>
-      </w:r>
-    </w:p>
-    <w:p>
-      <w:pPr>
-        <w:pBdr>
-          <w:bottom w:val="single" w:sz="6" w:space="1" w:color="000000"/>
-        </w:pBdr>
-        <w:spacing w:before="360" w:after="52"/>
-      </w:pPr>
-      <w:r>
-        <w:rPr>
-          <w:rFonts w:ascii="Source Sans Pro" w:eastAsia="Source Sans Pro" w:hAnsi="Source Sans Pro" w:cs="Source Sans Pro"/>
-          <w:b/>
-          <w:bCs/>
-          <w:color w:val="000000"/>
-          <w:sz w:val="22"/>
-          <w:szCs w:val="22"/>
-        </w:rPr>
-        <w:t>Education</w:t>
+        <w:t>Master of Computer Applications (MCA)  ·  CGPA 7.29  · Bengaluru, India</w:t>
       </w:r>
     </w:p>
     <w:p>
@@ -170,7 +188,7 @@
         <w:tabs>
           <w:tab w:val="right" w:pos="10800"/>
         </w:tabs>
-        <w:spacing w:before="62"/>
+        <w:spacing w:before="20" w:after="0"/>
       </w:pPr>
       <w:r>
         <w:rPr>
@@ -181,7 +199,7 @@
           <w:sz w:val="19"/>
           <w:szCs w:val="19"/>
         </w:rPr>
-        <w:t>Presidency College</w:t>
+        <w:t>St. Claret College</w:t>
       </w:r>
       <w:r>
         <w:rPr>
@@ -198,12 +216,12 @@
           <w:sz w:val="19"/>
           <w:szCs w:val="19"/>
         </w:rPr>
-        <w:t>2021 – 2023</w:t>
-      </w:r>
-    </w:p>
-    <w:p>
-      <w:pPr>
-        <w:spacing w:before="8"/>
+        <w:t>2018 – 2021</w:t>
+      </w:r>
+    </w:p>
+    <w:p>
+      <w:pPr>
+        <w:spacing w:before="8" w:after="0"/>
       </w:pPr>
       <w:r>
         <w:rPr>
@@ -214,7 +232,7 @@
           <w:sz w:val="17"/>
           <w:szCs w:val="17"/>
         </w:rPr>
-        <w:t>Master of Computer Applications (MCA)  ·  CGPA 7.29  · Bengaluru, India</w:t>
+        <w:t>Bachelor of Computer Applications (BCA)  ·  CGPA 7.21  ·  Bengaluru, India</w:t>
       </w:r>
     </w:p>
     <w:p>
@@ -222,7 +240,7 @@
         <w:tabs>
           <w:tab w:val="right" w:pos="10800"/>
         </w:tabs>
-        <w:spacing w:before="62"/>
+        <w:spacing w:before="20" w:after="0"/>
       </w:pPr>
       <w:r>
         <w:rPr>
@@ -233,7 +251,7 @@
           <w:sz w:val="19"/>
           <w:szCs w:val="19"/>
         </w:rPr>
-        <w:t>St. Claret College</w:t>
+        <w:t>St. Claret PU College</w:t>
       </w:r>
       <w:r>
         <w:rPr>
@@ -250,12 +268,12 @@
           <w:sz w:val="19"/>
           <w:szCs w:val="19"/>
         </w:rPr>
-        <w:t>2018 – 2021</w:t>
-      </w:r>
-    </w:p>
-    <w:p>
-      <w:pPr>
-        <w:spacing w:before="8"/>
+        <w:t>2016 – 2018</w:t>
+      </w:r>
+    </w:p>
+    <w:p>
+      <w:pPr>
+        <w:spacing w:before="8" w:after="0"/>
       </w:pPr>
       <w:r>
         <w:rPr>
@@ -266,7 +284,31 @@
           <w:sz w:val="17"/>
           <w:szCs w:val="17"/>
         </w:rPr>
-        <w:t>Bachelor of Computer Applications (BCA)  ·  CGPA 7.21  ·  Bengaluru, India</w:t>
+        <w:t>Higher Secondary (12th)  ·  Bengaluru, India</w:t>
+      </w:r>
+    </w:p>
+    <w:p>
+      <w:pPr>
+        <w:spacing w:before="23" w:after="23"/>
+      </w:pPr>
+    </w:p>
+    <w:p>
+      <w:pPr>
+        <w:pBdr>
+          <w:bottom w:val="single" w:sz="6" w:space="1" w:color="000000"/>
+        </w:pBdr>
+        <w:spacing w:before="113" w:after="0"/>
+      </w:pPr>
+      <w:r>
+        <w:rPr>
+          <w:rFonts w:ascii="Source Sans Pro" w:eastAsia="Source Sans Pro" w:hAnsi="Source Sans Pro" w:cs="Source Sans Pro"/>
+          <w:b/>
+          <w:bCs/>
+          <w:color w:val="000000"/>
+          <w:sz w:val="22"/>
+          <w:szCs w:val="22"/>
+        </w:rPr>
+        <w:t>Work Experience</w:t>
       </w:r>
     </w:p>
     <w:p>
@@ -274,7 +316,7 @@
         <w:tabs>
           <w:tab w:val="right" w:pos="10800"/>
         </w:tabs>
-        <w:spacing w:before="62"/>
+        <w:spacing w:before="20" w:after="0"/>
       </w:pPr>
       <w:r>
         <w:rPr>
@@ -285,7 +327,7 @@
           <w:sz w:val="19"/>
           <w:szCs w:val="19"/>
         </w:rPr>
-        <w:t>St. Claret PU College</w:t>
+        <w:t>Support Operations Specialist</w:t>
       </w:r>
       <w:r>
         <w:rPr>
@@ -298,51 +340,19 @@
       <w:r>
         <w:rPr>
           <w:rFonts w:ascii="Source Sans Pro" w:eastAsia="Source Sans Pro" w:hAnsi="Source Sans Pro" w:cs="Source Sans Pro"/>
+          <w:sz w:val="19"/>
+          <w:szCs w:val="19"/>
+        </w:rPr>
+        <w:t xml:space="preserve">  </w:t>
+      </w:r>
+      <w:r>
+        <w:rPr>
+          <w:rFonts w:ascii="Source Sans Pro" w:eastAsia="Source Sans Pro" w:hAnsi="Source Sans Pro" w:cs="Source Sans Pro"/>
           <w:color w:val="555555"/>
           <w:sz w:val="19"/>
           <w:szCs w:val="19"/>
         </w:rPr>
-        <w:t>2016 – 2018</w:t>
-      </w:r>
-    </w:p>
-    <w:p>
-      <w:pPr>
-        <w:spacing w:before="8"/>
-      </w:pPr>
-      <w:r>
-        <w:rPr>
-          <w:rFonts w:ascii="Source Sans Pro" w:eastAsia="Source Sans Pro" w:hAnsi="Source Sans Pro" w:cs="Source Sans Pro"/>
-          <w:i/>
-          <w:iCs/>
-          <w:color w:val="555555"/>
-          <w:sz w:val="17"/>
-          <w:szCs w:val="17"/>
-        </w:rPr>
-        <w:t>Higher Secondary (12th)  ·  Bengaluru, India</w:t>
-      </w:r>
-    </w:p>
-    <w:p>
-      <w:pPr>
-        <w:spacing w:before="8"/>
-      </w:pPr>
-    </w:p>
-    <w:p>
-      <w:pPr>
-        <w:pBdr>
-          <w:bottom w:val="single" w:sz="6" w:space="1" w:color="000000"/>
-        </w:pBdr>
-        <w:spacing w:before="155" w:after="52"/>
-      </w:pPr>
-      <w:r>
-        <w:rPr>
-          <w:rFonts w:ascii="Source Sans Pro" w:eastAsia="Source Sans Pro" w:hAnsi="Source Sans Pro" w:cs="Source Sans Pro"/>
-          <w:b/>
-          <w:bCs/>
-          <w:color w:val="000000"/>
-          <w:sz w:val="22"/>
-          <w:szCs w:val="22"/>
-        </w:rPr>
-        <w:t>Work Experience</w:t>
+        <w:t>Jun. 2024 – Jan. 2026</w:t>
       </w:r>
     </w:p>
     <w:p>
@@ -350,51 +360,7 @@
         <w:tabs>
           <w:tab w:val="right" w:pos="10800"/>
         </w:tabs>
-        <w:spacing w:before="62"/>
-      </w:pPr>
-      <w:r>
-        <w:rPr>
-          <w:rFonts w:ascii="Source Sans Pro" w:eastAsia="Source Sans Pro" w:hAnsi="Source Sans Pro" w:cs="Source Sans Pro"/>
-          <w:b/>
-          <w:bCs/>
-          <w:color w:val="000000"/>
-          <w:sz w:val="19"/>
-          <w:szCs w:val="19"/>
-        </w:rPr>
-        <w:t>Support Operations Specialist</w:t>
-      </w:r>
-      <w:r>
-        <w:rPr>
-          <w:rFonts w:ascii="Source Sans Pro" w:eastAsia="Source Sans Pro" w:hAnsi="Source Sans Pro" w:cs="Source Sans Pro"/>
-          <w:sz w:val="19"/>
-          <w:szCs w:val="19"/>
-        </w:rPr>
-        <w:tab/>
-      </w:r>
-      <w:r>
-        <w:rPr>
-          <w:rFonts w:ascii="Source Sans Pro" w:eastAsia="Source Sans Pro" w:hAnsi="Source Sans Pro" w:cs="Source Sans Pro"/>
-          <w:sz w:val="19"/>
-          <w:szCs w:val="19"/>
-        </w:rPr>
-        <w:t xml:space="preserve">  </w:t>
-      </w:r>
-      <w:r>
-        <w:rPr>
-          <w:rFonts w:ascii="Source Sans Pro" w:eastAsia="Source Sans Pro" w:hAnsi="Source Sans Pro" w:cs="Source Sans Pro"/>
-          <w:color w:val="555555"/>
-          <w:sz w:val="19"/>
-          <w:szCs w:val="19"/>
-        </w:rPr>
-        <w:t>Jun. 2024 – Jan. 2026</w:t>
-      </w:r>
-    </w:p>
-    <w:p>
-      <w:pPr>
-        <w:tabs>
-          <w:tab w:val="right" w:pos="10800"/>
-        </w:tabs>
-        <w:spacing w:before="8"/>
+        <w:spacing w:before="8" w:after="0"/>
       </w:pPr>
       <w:r>
         <w:rPr>
@@ -438,34 +404,16 @@
           <w:ilvl w:val="0"/>
           <w:numId w:val="2"/>
         </w:numPr>
-        <w:spacing w:before="13" w:after="13"/>
-      </w:pPr>
-      <w:r>
-        <w:rPr>
-          <w:rFonts w:ascii="Source Sans Pro" w:eastAsia="Source Sans Pro" w:hAnsi="Source Sans Pro" w:cs="Source Sans Pro"/>
-          <w:color w:val="000000"/>
-          <w:sz w:val="19"/>
-          <w:szCs w:val="19"/>
-        </w:rPr>
-        <w:t>Triaged 50+ weekly inventory reimbursement cases by severity and policy eligibility, mirroring the structured alert triage and escalation workflow used in SOC Tier 1 analyst roles.</w:t>
-      </w:r>
-      <w:proofErr w:type="spellStart"/>
-      <w:r>
-        <w:rPr>
-          <w:rFonts w:ascii="Source Sans Pro" w:eastAsia="Source Sans Pro" w:hAnsi="Source Sans Pro" w:cs="Source Sans Pro"/>
-          <w:color w:val="000000"/>
-          <w:sz w:val="19"/>
-          <w:szCs w:val="19"/>
-        </w:rPr>
-      </w:r>
-      <w:proofErr w:type="spellEnd"/>
-      <w:r>
-        <w:rPr>
-          <w:rFonts w:ascii="Source Sans Pro" w:eastAsia="Source Sans Pro" w:hAnsi="Source Sans Pro" w:cs="Source Sans Pro"/>
-          <w:color w:val="000000"/>
-          <w:sz w:val="19"/>
-          <w:szCs w:val="19"/>
-        </w:rPr>
+        <w:spacing w:before="13" w:after="34"/>
+      </w:pPr>
+      <w:r>
+        <w:rPr>
+          <w:rFonts w:ascii="Source Sans Pro" w:eastAsia="Source Sans Pro" w:hAnsi="Source Sans Pro" w:cs="Source Sans Pro"/>
+          <w:color w:val="000000"/>
+          <w:sz w:val="19"/>
+          <w:szCs w:val="19"/>
+        </w:rPr>
+        <w:t>Triaged 50+ weekly inventory reimbursement cases by severity and policy eligibility, applying structured case triage, escalation, and decision workflows to inform cybersecurity risk management.</w:t>
       </w:r>
     </w:p>
     <w:p>
@@ -475,16 +423,16 @@
           <w:ilvl w:val="0"/>
           <w:numId w:val="2"/>
         </w:numPr>
-        <w:spacing w:before="13" w:after="13"/>
-      </w:pPr>
-      <w:r>
-        <w:rPr>
-          <w:rFonts w:ascii="Source Sans Pro" w:eastAsia="Source Sans Pro" w:hAnsi="Source Sans Pro" w:cs="Source Sans Pro"/>
-          <w:color w:val="000000"/>
-          <w:sz w:val="19"/>
-          <w:szCs w:val="19"/>
-        </w:rPr>
-        <w:t>Performed root cause analysis on seller claims to identify policy violations and anomalous patterns; escalated findings to senior reviewers, demonstrating investigative instincts central to SOC and fraud analyst operations.</w:t>
+        <w:spacing w:before="13" w:after="34"/>
+      </w:pPr>
+      <w:r>
+        <w:rPr>
+          <w:rFonts w:ascii="Source Sans Pro" w:eastAsia="Source Sans Pro" w:hAnsi="Source Sans Pro" w:cs="Source Sans Pro"/>
+          <w:color w:val="000000"/>
+          <w:sz w:val="19"/>
+          <w:szCs w:val="19"/>
+        </w:rPr>
+        <w:t>Investigated seller claims, identifying policy violations and anomalous patterns, and escalated findings to senior reviewers for incident response and vulnerability assessment.</w:t>
       </w:r>
     </w:p>
     <w:p>
@@ -494,16 +442,16 @@
           <w:ilvl w:val="0"/>
           <w:numId w:val="2"/>
         </w:numPr>
-        <w:spacing w:before="13" w:after="13"/>
-      </w:pPr>
-      <w:r>
-        <w:rPr>
-          <w:rFonts w:ascii="Source Sans Pro" w:eastAsia="Source Sans Pro" w:hAnsi="Source Sans Pro" w:cs="Source Sans Pro"/>
-          <w:color w:val="000000"/>
-          <w:sz w:val="19"/>
-          <w:szCs w:val="19"/>
-        </w:rPr>
-        <w:t>Maintained audit-ready case documentation recording investigation findings, decisions, and corrective actions, establishing the evidence chain-of-custody discipline required for security incident reporting and IT audit.</w:t>
+        <w:spacing w:before="13" w:after="34"/>
+      </w:pPr>
+      <w:r>
+        <w:rPr>
+          <w:rFonts w:ascii="Source Sans Pro" w:eastAsia="Source Sans Pro" w:hAnsi="Source Sans Pro" w:cs="Source Sans Pro"/>
+          <w:color w:val="000000"/>
+          <w:sz w:val="19"/>
+          <w:szCs w:val="19"/>
+        </w:rPr>
+        <w:t>Maintained audit-ready case documentation, recording investigation findings, decisions, evidence notes, and corrective actions to ensure compliance and inform cybersecurity risk management.</w:t>
       </w:r>
     </w:p>
     <w:p>
@@ -513,24 +461,21 @@
           <w:ilvl w:val="0"/>
           <w:numId w:val="2"/>
         </w:numPr>
-        <w:spacing w:before="13" w:after="13"/>
-      </w:pPr>
-      <w:r>
-        <w:rPr>
-          <w:rFonts w:ascii="Source Sans Pro" w:eastAsia="Source Sans Pro" w:hAnsi="Source Sans Pro" w:cs="Source Sans Pro"/>
-          <w:color w:val="000000"/>
-          <w:sz w:val="19"/>
-          <w:szCs w:val="19"/>
-        </w:rPr>
-        <w:t>Collaborated with compliance and risk teams to enforce regulatory policies, identify process vulnerabilities, and implement corrective controls, building operational instincts in risk management and compliance monitoring.</w:t>
-      </w:r>
-    </w:p>
-    <w:p>
-      <w:pPr>
-        <w:pBdr>
-          <w:bottom w:val="single" w:sz="6" w:space="1" w:color="000000"/>
-        </w:pBdr>
-        <w:spacing w:before="155" w:after="52"/>
+        <w:spacing w:before="13" w:after="34"/>
+      </w:pPr>
+      <w:r>
+        <w:rPr>
+          <w:rFonts w:ascii="Source Sans Pro" w:eastAsia="Source Sans Pro" w:hAnsi="Source Sans Pro" w:cs="Source Sans Pro"/>
+          <w:color w:val="000000"/>
+          <w:sz w:val="19"/>
+          <w:szCs w:val="19"/>
+        </w:rPr>
+        <w:t>Spotted recurring fraud patterns across 200+ weekly cases and flagged them early, reducing repeat-issue investigation time and informing cybersecurity risk management.</w:t>
+      </w:r>
+    </w:p>
+    <w:p>
+      <w:pPr>
+        <w:spacing w:before="23" w:after="23"/>
         <w:rPr>
           <w:rFonts w:ascii="Source Sans Pro" w:eastAsia="Source Sans Pro" w:hAnsi="Source Sans Pro" w:cs="Source Sans Pro"/>
           <w:b/>
@@ -543,10 +488,7 @@
     </w:p>
     <w:p>
       <w:pPr>
-        <w:pBdr>
-          <w:bottom w:val="single" w:sz="6" w:space="1" w:color="000000"/>
-        </w:pBdr>
-        <w:spacing w:before="155" w:after="52"/>
+        <w:spacing w:before="106" w:after="13"/>
       </w:pPr>
       <w:r>
         <w:rPr>
@@ -565,76 +507,19 @@
         <w:tabs>
           <w:tab w:val="right" w:pos="10800"/>
         </w:tabs>
-        <w:spacing w:before="62"/>
-      </w:pPr>
-      <w:r>
-        <w:rPr>
-          <w:rFonts w:ascii="Source Sans Pro" w:eastAsia="Source Sans Pro" w:hAnsi="Source Sans Pro" w:cs="Source Sans Pro"/>
-          <w:b/>
-          <w:bCs/>
-          <w:color w:val="000000"/>
-          <w:sz w:val="19"/>
-          <w:szCs w:val="19"/>
-        </w:rPr>
-        <w:t xml:space="preserve">Cybersecurity SOC &amp; Threat Detection Home Lab  |  </w:t>
-        <w:tab/>
-        <w:t>Splunk (SPL), Wireshark, Nmap, Burp Suite, Linux, MITRE ATT&amp;CK, TryHackMe</w:t>
-      </w:r>
-      <w:r>
-        <w:rPr>
-          <w:rFonts w:ascii="Source Sans Pro" w:eastAsia="Source Sans Pro" w:hAnsi="Source Sans Pro" w:cs="Source Sans Pro"/>
-          <w:color w:val="555555"/>
-          <w:sz w:val="19"/>
-          <w:szCs w:val="19"/>
-        </w:rPr>
-      </w:r>
-      <w:hyperlink r:id="rId8" w:history="1">
+        <w:spacing w:before="20" w:after="0"/>
+      </w:pPr>
+      <w:hyperlink r:id="rId8">
         <w:r>
           <w:rPr>
-            <w:noProof/>
+            <w:rFonts w:ascii="Source Sans Pro" w:eastAsia="Source Sans Pro" w:hAnsi="Source Sans Pro" w:cs="Source Sans Pro"/>
+            <w:b/>
+            <w:color w:val="000000"/>
+            <w:sz w:val="19"/>
+            <w:szCs w:val="19"/>
+            <w:u w:val="single"/>
           </w:rPr>
-          <w:drawing>
-            <wp:inline distT="0" distB="0" distL="0" distR="0" wp14:anchorId="7B56B168" wp14:editId="47E0EAC7">
-              <wp:extent cx="104775" cy="104775"/>
-              <wp:effectExtent l="0" t="0" r="0" b="0"/>
-              <wp:docPr id="1471047774" name="Picture 1471047774">
-                <a:hlinkClick xmlns:a="http://schemas.openxmlformats.org/drawingml/2006/main" r:id="rId8"/>
-              </wp:docPr>
-              <wp:cNvGraphicFramePr>
-                <a:graphicFrameLocks xmlns:a="http://schemas.openxmlformats.org/drawingml/2006/main" noChangeAspect="1"/>
-              </wp:cNvGraphicFramePr>
-              <a:graphic xmlns:a="http://schemas.openxmlformats.org/drawingml/2006/main">
-                <a:graphicData uri="http://schemas.openxmlformats.org/drawingml/2006/picture">
-                  <pic:pic xmlns:pic="http://schemas.openxmlformats.org/drawingml/2006/picture">
-                    <pic:nvPicPr>
-                      <pic:cNvPr id="0" name="">
-                        <a:hlinkClick r:id="rId8"/>
-                      </pic:cNvPr>
-                      <pic:cNvPicPr>
-                        <a:picLocks noChangeAspect="1" noChangeArrowheads="1"/>
-                      </pic:cNvPicPr>
-                    </pic:nvPicPr>
-                    <pic:blipFill>
-                      <a:blip r:embed="rId9"/>
-                      <a:srcRect/>
-                      <a:stretch>
-                        <a:fillRect/>
-                      </a:stretch>
-                    </pic:blipFill>
-                    <pic:spPr bwMode="auto">
-                      <a:xfrm>
-                        <a:off x="0" y="0"/>
-                        <a:ext cx="104775" cy="104775"/>
-                      </a:xfrm>
-                      <a:prstGeom prst="rect">
-                        <a:avLst/>
-                      </a:prstGeom>
-                    </pic:spPr>
-                  </pic:pic>
-                </a:graphicData>
-              </a:graphic>
-            </wp:inline>
-          </w:drawing>
+          <w:t>SOC Automation and Threat Detection Lab</w:t>
         </w:r>
       </w:hyperlink>
       <w:r>
@@ -643,25 +528,25 @@
           <w:sz w:val="19"/>
           <w:szCs w:val="19"/>
         </w:rPr>
-      </w:r>
-      <w:r>
-        <w:rPr>
-          <w:rFonts w:ascii="Source Sans Pro" w:eastAsia="Source Sans Pro" w:hAnsi="Source Sans Pro" w:cs="Source Sans Pro"/>
-          <w:color w:val="555555"/>
-          <w:sz w:val="19"/>
-          <w:szCs w:val="19"/>
-        </w:rPr>
-      </w:r>
-      <w:proofErr w:type="spellStart"/>
-      <w:r>
-        <w:rPr>
-          <w:rFonts w:ascii="Source Sans Pro" w:eastAsia="Source Sans Pro" w:hAnsi="Source Sans Pro" w:cs="Source Sans Pro"/>
-          <w:color w:val="555555"/>
-          <w:sz w:val="19"/>
-          <w:szCs w:val="19"/>
-        </w:rPr>
-      </w:r>
-      <w:proofErr w:type="spellEnd"/>
+        <w:t xml:space="preserve">  |  </w:t>
+      </w:r>
+      <w:r>
+        <w:rPr>
+          <w:rFonts w:ascii="Source Sans Pro" w:eastAsia="Source Sans Pro" w:hAnsi="Source Sans Pro" w:cs="Source Sans Pro"/>
+          <w:sz w:val="19"/>
+          <w:szCs w:val="19"/>
+        </w:rPr>
+        <w:tab/>
+      </w:r>
+      <w:r>
+        <w:rPr>
+          <w:rFonts w:ascii="Source Sans Pro" w:eastAsia="Source Sans Pro" w:hAnsi="Source Sans Pro" w:cs="Source Sans Pro"/>
+          <w:i/>
+          <w:sz w:val="19"/>
+          <w:szCs w:val="19"/>
+        </w:rPr>
+        <w:t>Python, Splunk, Wireshark, Nmap, MITRE ATT&amp;CK</w:t>
+      </w:r>
     </w:p>
     <w:p>
       <w:pPr>
@@ -670,16 +555,16 @@
           <w:ilvl w:val="0"/>
           <w:numId w:val="2"/>
         </w:numPr>
-        <w:spacing w:before="13" w:after="13"/>
-      </w:pPr>
-      <w:r>
-        <w:rPr>
-          <w:rFonts w:ascii="Source Sans Pro" w:eastAsia="Source Sans Pro" w:hAnsi="Source Sans Pro" w:cs="Source Sans Pro"/>
-          <w:color w:val="000000"/>
-          <w:sz w:val="19"/>
-          <w:szCs w:val="19"/>
-        </w:rPr>
-        <w:t>Deployed Splunk SIEM and authored SPL correlation searches for brute-force detection, lateral movement, and privilege escalation; mapped TTPs to MITRE ATT&amp;CK (T1110, T1078, T1059) and wrote PICERL incident report.</w:t>
+        <w:spacing w:before="13" w:after="34"/>
+      </w:pPr>
+      <w:r>
+        <w:rPr>
+          <w:rFonts w:ascii="Source Sans Pro" w:eastAsia="Source Sans Pro" w:hAnsi="Source Sans Pro" w:cs="Source Sans Pro"/>
+          <w:color w:val="000000"/>
+          <w:sz w:val="19"/>
+          <w:szCs w:val="19"/>
+        </w:rPr>
+        <w:t>Deployed Splunk SIEM with SPL searches for brute-force detection, lateral movement, and privilege escalation (T1110, T1078, T1059); mapped TTPs and wrote PICERL incident report.</w:t>
       </w:r>
     </w:p>
     <w:p>
@@ -689,16 +574,16 @@
           <w:ilvl w:val="0"/>
           <w:numId w:val="2"/>
         </w:numPr>
-        <w:spacing w:before="13" w:after="13"/>
-      </w:pPr>
-      <w:r>
-        <w:rPr>
-          <w:rFonts w:ascii="Source Sans Pro" w:eastAsia="Source Sans Pro" w:hAnsi="Source Sans Pro" w:cs="Source Sans Pro"/>
-          <w:color w:val="000000"/>
-          <w:sz w:val="19"/>
-          <w:szCs w:val="19"/>
-        </w:rPr>
-        <w:t>Analysed TCP/IP traffic in Wireshark — isolated HTTP/DNS flows, detected plaintext credential exposure, identified SYN scan patterns and DNS tunnelling anomalies indicative of C2 communication.</w:t>
+        <w:spacing w:before="32" w:after="32"/>
+      </w:pPr>
+      <w:r>
+        <w:rPr>
+          <w:rFonts w:ascii="Source Sans Pro" w:eastAsia="Source Sans Pro" w:hAnsi="Source Sans Pro" w:cs="Source Sans Pro"/>
+          <w:color w:val="000000"/>
+          <w:sz w:val="19"/>
+          <w:szCs w:val="19"/>
+        </w:rPr>
+        <w:t>Developed SOAR-style pipeline: Python script ingests Splunk alerts, enriches with VirusTotal API, and dispatches Telegram notifications with severity classification.</w:t>
       </w:r>
     </w:p>
     <w:p>
@@ -708,52 +593,67 @@
           <w:ilvl w:val="0"/>
           <w:numId w:val="2"/>
         </w:numPr>
-        <w:spacing w:before="13" w:after="13"/>
-      </w:pPr>
-      <w:r>
-        <w:rPr>
-          <w:rFonts w:ascii="Source Sans Pro" w:eastAsia="Source Sans Pro" w:hAnsi="Source Sans Pro" w:cs="Source Sans Pro"/>
-          <w:color w:val="000000"/>
-          <w:sz w:val="19"/>
-          <w:szCs w:val="19"/>
-        </w:rPr>
-        <w:t>Conducted network reconnaissance with Nmap (host discovery, OS fingerprinting, service-version detection) and SQL injection testing; documented OWASP Top 10 parameterised query remediation.</w:t>
-      </w:r>
-      <w:proofErr w:type="spellStart"/>
-      <w:r>
-        <w:rPr>
-          <w:rFonts w:ascii="Source Sans Pro" w:eastAsia="Source Sans Pro" w:hAnsi="Source Sans Pro" w:cs="Source Sans Pro"/>
-          <w:color w:val="000000"/>
-          <w:sz w:val="19"/>
-          <w:szCs w:val="19"/>
-        </w:rPr>
-      </w:r>
-      <w:proofErr w:type="spellEnd"/>
-      <w:r>
-        <w:rPr>
-          <w:rFonts w:ascii="Source Sans Pro" w:eastAsia="Source Sans Pro" w:hAnsi="Source Sans Pro" w:cs="Source Sans Pro"/>
-          <w:color w:val="000000"/>
-          <w:sz w:val="19"/>
-          <w:szCs w:val="19"/>
-        </w:rPr>
-      </w:r>
-      <w:proofErr w:type="spellStart"/>
-      <w:r>
-        <w:rPr>
-          <w:rFonts w:ascii="Source Sans Pro" w:eastAsia="Source Sans Pro" w:hAnsi="Source Sans Pro" w:cs="Source Sans Pro"/>
-          <w:color w:val="000000"/>
-          <w:sz w:val="19"/>
-          <w:szCs w:val="19"/>
-        </w:rPr>
-      </w:r>
-      <w:proofErr w:type="spellEnd"/>
-      <w:r>
-        <w:rPr>
-          <w:rFonts w:ascii="Source Sans Pro" w:eastAsia="Source Sans Pro" w:hAnsi="Source Sans Pro" w:cs="Source Sans Pro"/>
-          <w:color w:val="000000"/>
-          <w:sz w:val="19"/>
-          <w:szCs w:val="19"/>
-        </w:rPr>
+        <w:spacing w:before="13" w:after="34"/>
+      </w:pPr>
+      <w:r>
+        <w:rPr>
+          <w:rFonts w:ascii="Source Sans Pro" w:eastAsia="Source Sans Pro" w:hAnsi="Source Sans Pro" w:cs="Source Sans Pro"/>
+          <w:color w:val="000000"/>
+          <w:sz w:val="19"/>
+          <w:szCs w:val="19"/>
+        </w:rPr>
+        <w:t>Converted detection logic to Sigma rules; analyzed TCP/IP traffic in Wireshark for SYN scans, DNS tunnelling, and plaintext credential exposure.</w:t>
+      </w:r>
+    </w:p>
+    <w:p>
+      <w:pPr>
+        <w:spacing w:before="23" w:after="23"/>
+      </w:pPr>
+    </w:p>
+    <w:p>
+      <w:pPr>
+        <w:tabs>
+          <w:tab w:val="right" w:pos="10800"/>
+        </w:tabs>
+        <w:spacing w:before="30" w:after="0"/>
+      </w:pPr>
+      <w:hyperlink r:id="rId9">
+        <w:r>
+          <w:rPr>
+            <w:rFonts w:ascii="Source Sans Pro" w:eastAsia="Source Sans Pro" w:hAnsi="Source Sans Pro" w:cs="Source Sans Pro"/>
+            <w:b/>
+            <w:color w:val="000000"/>
+            <w:sz w:val="19"/>
+            <w:szCs w:val="19"/>
+            <w:u w:val="single"/>
+          </w:rPr>
+          <w:t>Phishing and OSINT Threat Intelligence Tool</w:t>
+        </w:r>
+      </w:hyperlink>
+      <w:r>
+        <w:rPr>
+          <w:rFonts w:ascii="Source Sans Pro" w:eastAsia="Source Sans Pro" w:hAnsi="Source Sans Pro" w:cs="Source Sans Pro"/>
+          <w:sz w:val="19"/>
+          <w:szCs w:val="19"/>
+        </w:rPr>
+        <w:t xml:space="preserve">  |  </w:t>
+      </w:r>
+      <w:r>
+        <w:rPr>
+          <w:rFonts w:ascii="Source Sans Pro" w:eastAsia="Source Sans Pro" w:hAnsi="Source Sans Pro" w:cs="Source Sans Pro"/>
+          <w:sz w:val="19"/>
+          <w:szCs w:val="19"/>
+        </w:rPr>
+        <w:tab/>
+      </w:r>
+      <w:r>
+        <w:rPr>
+          <w:rFonts w:ascii="Source Sans Pro" w:eastAsia="Source Sans Pro" w:hAnsi="Source Sans Pro" w:cs="Source Sans Pro"/>
+          <w:i/>
+          <w:sz w:val="19"/>
+          <w:szCs w:val="19"/>
+        </w:rPr>
+        <w:t>Python, VirusTotal API, AbuseIPDB, WHOIS, Telegram bot</w:t>
       </w:r>
     </w:p>
     <w:p>
@@ -763,150 +663,16 @@
           <w:ilvl w:val="0"/>
           <w:numId w:val="2"/>
         </w:numPr>
-        <w:spacing w:before="13" w:after="13"/>
-      </w:pPr>
-      <w:r>
-        <w:rPr>
-          <w:rFonts w:ascii="Source Sans Pro" w:eastAsia="Source Sans Pro" w:hAnsi="Source Sans Pro" w:cs="Source Sans Pro"/>
-          <w:color w:val="000000"/>
-          <w:sz w:val="19"/>
-          <w:szCs w:val="19"/>
-        </w:rPr>
-        <w:t>Completed 9 TryHackMe rooms: Windows Event Logs, Active Directory Basics, Phishing Analysis, SIEM fundamentals, and threat hunting — building hands-on SOC Tier 1 analyst skills.</w:t>
-      </w:r>
-      <w:proofErr w:type="spellStart"/>
-      <w:r>
-        <w:rPr>
-          <w:rFonts w:ascii="Source Sans Pro" w:eastAsia="Source Sans Pro" w:hAnsi="Source Sans Pro" w:cs="Source Sans Pro"/>
-          <w:color w:val="000000"/>
-          <w:sz w:val="19"/>
-          <w:szCs w:val="19"/>
-        </w:rPr>
-      </w:r>
-      <w:proofErr w:type="spellEnd"/>
-      <w:r>
-        <w:rPr>
-          <w:rFonts w:ascii="Source Sans Pro" w:eastAsia="Source Sans Pro" w:hAnsi="Source Sans Pro" w:cs="Source Sans Pro"/>
-          <w:color w:val="000000"/>
-          <w:sz w:val="19"/>
-          <w:szCs w:val="19"/>
-        </w:rPr>
-      </w:r>
-      <w:proofErr w:type="spellStart"/>
-      <w:r>
-        <w:rPr>
-          <w:rFonts w:ascii="Source Sans Pro" w:eastAsia="Source Sans Pro" w:hAnsi="Source Sans Pro" w:cs="Source Sans Pro"/>
-          <w:color w:val="000000"/>
-          <w:sz w:val="19"/>
-          <w:szCs w:val="19"/>
-        </w:rPr>
-      </w:r>
-      <w:proofErr w:type="spellEnd"/>
-      <w:r>
-        <w:rPr>
-          <w:rFonts w:ascii="Source Sans Pro" w:eastAsia="Source Sans Pro" w:hAnsi="Source Sans Pro" w:cs="Source Sans Pro"/>
-          <w:color w:val="000000"/>
-          <w:sz w:val="19"/>
-          <w:szCs w:val="19"/>
-        </w:rPr>
-      </w:r>
-    </w:p>
-    <w:p>
-      <w:pPr>
-        <w:spacing w:before="30"/>
-      </w:pPr>
-    </w:p>
-    <w:p>
-      <w:pPr>
-        <w:tabs>
-          <w:tab w:val="right" w:pos="10800"/>
-        </w:tabs>
-        <w:spacing w:before="30"/>
-      </w:pPr>
-      <w:r>
-        <w:rPr>
-          <w:rFonts w:ascii="Source Sans Pro" w:eastAsia="Source Sans Pro" w:hAnsi="Source Sans Pro" w:cs="Source Sans Pro"/>
-          <w:b/>
-          <w:bCs/>
-          <w:color w:val="000000"/>
-          <w:sz w:val="19"/>
-          <w:szCs w:val="19"/>
-        </w:rPr>
-        <w:t xml:space="preserve">GRC Compliance Automation &amp; Risk Intelligence Framework  |  </w:t>
-        <w:tab/>
-        <w:t>Python, NIST CSF, ISO 27001, PCI-DSS, GDPR/PDPB, Excel, Git</w:t>
-      </w:r>
-      <w:r>
-        <w:rPr>
-          <w:rFonts w:ascii="Source Sans Pro" w:eastAsia="Source Sans Pro" w:hAnsi="Source Sans Pro" w:cs="Source Sans Pro"/>
-          <w:color w:val="555555"/>
-          <w:sz w:val="19"/>
-          <w:szCs w:val="19"/>
-        </w:rPr>
-      </w:r>
-      <w:hyperlink r:id="rId10" w:history="1">
-        <w:r>
-          <w:rPr>
-            <w:noProof/>
-          </w:rPr>
-          <w:drawing>
-            <wp:inline distT="0" distB="0" distL="0" distR="0" wp14:anchorId="1A9BA1D9" wp14:editId="5F9CB53B">
-              <wp:extent cx="104775" cy="104775"/>
-              <wp:effectExtent l="0" t="0" r="0" b="0"/>
-              <wp:docPr id="1521653308" name="Picture 1521653308">
-                <a:hlinkClick xmlns:a="http://schemas.openxmlformats.org/drawingml/2006/main" r:id="rId10"/>
-              </wp:docPr>
-              <wp:cNvGraphicFramePr>
-                <a:graphicFrameLocks xmlns:a="http://schemas.openxmlformats.org/drawingml/2006/main" noChangeAspect="1"/>
-              </wp:cNvGraphicFramePr>
-              <a:graphic xmlns:a="http://schemas.openxmlformats.org/drawingml/2006/main">
-                <a:graphicData uri="http://schemas.openxmlformats.org/drawingml/2006/picture">
-                  <pic:pic xmlns:pic="http://schemas.openxmlformats.org/drawingml/2006/picture">
-                    <pic:nvPicPr>
-                      <pic:cNvPr id="0" name="">
-                        <a:hlinkClick r:id="rId10"/>
-                      </pic:cNvPr>
-                      <pic:cNvPicPr>
-                        <a:picLocks noChangeAspect="1" noChangeArrowheads="1"/>
-                      </pic:cNvPicPr>
-                    </pic:nvPicPr>
-                    <pic:blipFill>
-                      <a:blip r:embed="rId9"/>
-                      <a:srcRect/>
-                      <a:stretch>
-                        <a:fillRect/>
-                      </a:stretch>
-                    </pic:blipFill>
-                    <pic:spPr bwMode="auto">
-                      <a:xfrm>
-                        <a:off x="0" y="0"/>
-                        <a:ext cx="104775" cy="104775"/>
-                      </a:xfrm>
-                      <a:prstGeom prst="rect">
-                        <a:avLst/>
-                      </a:prstGeom>
-                    </pic:spPr>
-                  </pic:pic>
-                </a:graphicData>
-              </a:graphic>
-            </wp:inline>
-          </w:drawing>
-        </w:r>
-      </w:hyperlink>
-      <w:r>
-        <w:rPr>
-          <w:rFonts w:ascii="Source Sans Pro" w:eastAsia="Source Sans Pro" w:hAnsi="Source Sans Pro" w:cs="Source Sans Pro"/>
-          <w:sz w:val="19"/>
-          <w:szCs w:val="19"/>
-        </w:rPr>
-      </w:r>
-      <w:r>
-        <w:rPr>
-          <w:rFonts w:ascii="Source Sans Pro" w:eastAsia="Source Sans Pro" w:hAnsi="Source Sans Pro" w:cs="Source Sans Pro"/>
-          <w:color w:val="555555"/>
-          <w:sz w:val="19"/>
-          <w:szCs w:val="19"/>
-        </w:rPr>
+        <w:spacing w:before="13" w:after="34"/>
+      </w:pPr>
+      <w:r>
+        <w:rPr>
+          <w:rFonts w:ascii="Source Sans Pro" w:eastAsia="Source Sans Pro" w:hAnsi="Source Sans Pro" w:cs="Source Sans Pro"/>
+          <w:color w:val="000000"/>
+          <w:sz w:val="19"/>
+          <w:szCs w:val="19"/>
+        </w:rPr>
+        <w:t>Built multi-API threat intelligence pipeline: submits suspicious data to VirusTotal, AbuseIPDB, and URLScan.io; cross-references WHOIS, DNS, and SSL details to produce a unified phishing probability score (EPSS 85).</w:t>
       </w:r>
     </w:p>
     <w:p>
@@ -916,16 +682,16 @@
           <w:ilvl w:val="0"/>
           <w:numId w:val="2"/>
         </w:numPr>
-        <w:spacing w:before="13" w:after="13"/>
-      </w:pPr>
-      <w:r>
-        <w:rPr>
-          <w:rFonts w:ascii="Source Sans Pro" w:eastAsia="Source Sans Pro" w:hAnsi="Source Sans Pro" w:cs="Source Sans Pro"/>
-          <w:color w:val="000000"/>
-          <w:sz w:val="19"/>
-          <w:szCs w:val="19"/>
-        </w:rPr>
-        <w:t>Developed Python GRC compliance tool mapping controls to NIST CSF, ISO 27001, and PCI-DSS; auto-generates gap analysis reports scoring each domain and flagging non-compliant controls.</w:t>
+        <w:spacing w:before="13" w:after="34"/>
+      </w:pPr>
+      <w:r>
+        <w:rPr>
+          <w:rFonts w:ascii="Source Sans Pro" w:eastAsia="Source Sans Pro" w:hAnsi="Source Sans Pro" w:cs="Source Sans Pro"/>
+          <w:color w:val="000000"/>
+          <w:sz w:val="19"/>
+          <w:szCs w:val="19"/>
+        </w:rPr>
+        <w:t>Developed typosquatting domain detector generating brand domain variants and checking live DNS resolution to catch brand-impersonation attacks.</w:t>
       </w:r>
     </w:p>
     <w:p>
@@ -935,16 +701,187 @@
           <w:ilvl w:val="0"/>
           <w:numId w:val="2"/>
         </w:numPr>
-        <w:spacing w:before="13" w:after="13"/>
-      </w:pPr>
-      <w:r>
-        <w:rPr>
-          <w:rFonts w:ascii="Source Sans Pro" w:eastAsia="Source Sans Pro" w:hAnsi="Source Sans Pro" w:cs="Source Sans Pro"/>
-          <w:color w:val="000000"/>
-          <w:sz w:val="19"/>
-          <w:szCs w:val="19"/>
-        </w:rPr>
-        <w:t>Built automated third-party vendor risk module computing quantitative risk scores across 12 domains aligned with enterprise TPRM frameworks.</w:t>
+        <w:spacing w:before="13" w:after="34"/>
+      </w:pPr>
+      <w:r>
+        <w:rPr>
+          <w:rFonts w:ascii="Source Sans Pro" w:eastAsia="Source Sans Pro" w:hAnsi="Source Sans Pro" w:cs="Source Sans Pro"/>
+          <w:color w:val="000000"/>
+          <w:sz w:val="19"/>
+          <w:szCs w:val="19"/>
+        </w:rPr>
+        <w:t>Deployed Telegram bot interface for live IOC enrichment, supporting bulk CSV input/output and OSINT enrichment via theHarvester for domain profiling.</w:t>
+      </w:r>
+    </w:p>
+    <w:p>
+      <w:pPr>
+        <w:pStyle w:val="ListParagraph"/>
+        <w:spacing w:before="23" w:after="23"/>
+        <w:ind w:left="450"/>
+      </w:pPr>
+    </w:p>
+    <w:p>
+      <w:pPr>
+        <w:pBdr>
+          <w:bottom w:val="single" w:sz="6" w:space="1" w:color="000000"/>
+        </w:pBdr>
+        <w:spacing w:before="113" w:after="0"/>
+      </w:pPr>
+      <w:r>
+        <w:rPr>
+          <w:rFonts w:ascii="Source Sans Pro" w:eastAsia="Source Sans Pro" w:hAnsi="Source Sans Pro" w:cs="Source Sans Pro"/>
+          <w:b/>
+          <w:bCs/>
+          <w:color w:val="000000"/>
+          <w:sz w:val="22"/>
+          <w:szCs w:val="22"/>
+        </w:rPr>
+        <w:t>Technical Skills</w:t>
+      </w:r>
+    </w:p>
+    <w:p>
+      <w:pPr>
+        <w:spacing w:before="43" w:after="43"/>
+      </w:pPr>
+      <w:r>
+        <w:rPr>
+          <w:rFonts w:ascii="Source Sans Pro" w:eastAsia="Source Sans Pro" w:hAnsi="Source Sans Pro" w:cs="Source Sans Pro"/>
+          <w:b/>
+          <w:sz w:val="19"/>
+          <w:szCs w:val="19"/>
+        </w:rPr>
+        <w:t xml:space="preserve">SOC Operations: </w:t>
+      </w:r>
+      <w:r>
+        <w:rPr>
+          <w:rFonts w:ascii="Source Sans Pro" w:eastAsia="Source Sans Pro" w:hAnsi="Source Sans Pro" w:cs="Source Sans Pro"/>
+          <w:sz w:val="19"/>
+          <w:szCs w:val="19"/>
+        </w:rPr>
+        <w:t>Alert triage, incident investigation, log analysis, threat detection, escalation, false positive analysis</w:t>
+      </w:r>
+    </w:p>
+    <w:p>
+      <w:pPr>
+        <w:spacing w:before="43" w:after="43"/>
+      </w:pPr>
+      <w:r>
+        <w:rPr>
+          <w:rFonts w:ascii="Source Sans Pro" w:eastAsia="Source Sans Pro" w:hAnsi="Source Sans Pro" w:cs="Source Sans Pro"/>
+          <w:b/>
+          <w:sz w:val="19"/>
+          <w:szCs w:val="19"/>
+        </w:rPr>
+        <w:t xml:space="preserve">SIEM &amp; Monitoring: </w:t>
+      </w:r>
+      <w:r>
+        <w:rPr>
+          <w:rFonts w:ascii="Source Sans Pro" w:eastAsia="Source Sans Pro" w:hAnsi="Source Sans Pro" w:cs="Source Sans Pro"/>
+          <w:sz w:val="19"/>
+          <w:szCs w:val="19"/>
+        </w:rPr>
+        <w:t>Splunk (SPL), Elastic SIEM (basic), Windows Event Logs, Sysmon, Wireshark</w:t>
+      </w:r>
+    </w:p>
+    <w:p>
+      <w:pPr>
+        <w:spacing w:before="43" w:after="43"/>
+      </w:pPr>
+      <w:r>
+        <w:rPr>
+          <w:rFonts w:ascii="Source Sans Pro" w:eastAsia="Source Sans Pro" w:hAnsi="Source Sans Pro" w:cs="Source Sans Pro"/>
+          <w:b/>
+          <w:sz w:val="19"/>
+          <w:szCs w:val="19"/>
+        </w:rPr>
+        <w:t xml:space="preserve">Threat Intelligence: </w:t>
+      </w:r>
+      <w:r>
+        <w:rPr>
+          <w:rFonts w:ascii="Source Sans Pro" w:eastAsia="Source Sans Pro" w:hAnsi="Source Sans Pro" w:cs="Source Sans Pro"/>
+          <w:sz w:val="19"/>
+          <w:szCs w:val="19"/>
+        </w:rPr>
+        <w:t>MITRE ATT&amp;CK, IOC analysis, VirusTotal, OSINT enrichment, Cyber Kill Chain</w:t>
+      </w:r>
+    </w:p>
+    <w:p>
+      <w:pPr>
+        <w:spacing w:before="43" w:after="43"/>
+      </w:pPr>
+      <w:r>
+        <w:rPr>
+          <w:rFonts w:ascii="Source Sans Pro" w:eastAsia="Source Sans Pro" w:hAnsi="Source Sans Pro" w:cs="Source Sans Pro"/>
+          <w:b/>
+          <w:sz w:val="19"/>
+          <w:szCs w:val="19"/>
+        </w:rPr>
+        <w:t xml:space="preserve">Systems &amp; Networking: </w:t>
+      </w:r>
+      <w:r>
+        <w:rPr>
+          <w:rFonts w:ascii="Source Sans Pro" w:eastAsia="Source Sans Pro" w:hAnsi="Source Sans Pro" w:cs="Source Sans Pro"/>
+          <w:sz w:val="19"/>
+          <w:szCs w:val="19"/>
+        </w:rPr>
+        <w:t>Windows internals, Linux fundamentals, TCP/IP, DNS, HTTP/S, firewall and IDS/IPS concepts</w:t>
+      </w:r>
+    </w:p>
+    <w:p>
+      <w:pPr>
+        <w:spacing w:before="43" w:after="43"/>
+      </w:pPr>
+      <w:r>
+        <w:rPr>
+          <w:rFonts w:ascii="Source Sans Pro" w:eastAsia="Source Sans Pro" w:hAnsi="Source Sans Pro" w:cs="Source Sans Pro"/>
+          <w:b/>
+          <w:sz w:val="19"/>
+          <w:szCs w:val="19"/>
+        </w:rPr>
+        <w:t xml:space="preserve">Automation: </w:t>
+      </w:r>
+      <w:r>
+        <w:rPr>
+          <w:rFonts w:ascii="Source Sans Pro" w:eastAsia="Source Sans Pro" w:hAnsi="Source Sans Pro" w:cs="Source Sans Pro"/>
+          <w:sz w:val="19"/>
+          <w:szCs w:val="19"/>
+        </w:rPr>
+        <w:t>Python, Bash (basic), regular expressions, risk, management, response</w:t>
+      </w:r>
+    </w:p>
+    <w:p>
+      <w:pPr>
+        <w:pBdr>
+          <w:bottom w:val="single" w:sz="6" w:space="1" w:color="000000"/>
+        </w:pBdr>
+        <w:spacing w:before="23" w:after="23"/>
+        <w:rPr>
+          <w:rFonts w:ascii="Source Sans Pro" w:eastAsia="Source Sans Pro" w:hAnsi="Source Sans Pro" w:cs="Source Sans Pro"/>
+          <w:b/>
+          <w:bCs/>
+          <w:color w:val="000000"/>
+          <w:sz w:val="22"/>
+          <w:szCs w:val="22"/>
+        </w:rPr>
+      </w:pPr>
+    </w:p>
+    <w:p>
+      <w:pPr>
+        <w:pBdr>
+          <w:bottom w:val="single" w:sz="6" w:space="1" w:color="000000"/>
+        </w:pBdr>
+        <w:spacing w:before="113" w:after="0"/>
+      </w:pPr>
+      <w:r>
+        <w:rPr>
+          <w:rFonts w:ascii="Source Sans Pro" w:eastAsia="Source Sans Pro" w:hAnsi="Source Sans Pro" w:cs="Source Sans Pro"/>
+          <w:b/>
+          <w:bCs/>
+          <w:color w:val="000000"/>
+          <w:sz w:val="22"/>
+          <w:szCs w:val="22"/>
+        </w:rPr>
+        <w:t>Certifications</w:t>
       </w:r>
     </w:p>
     <w:p>
@@ -954,16 +891,16 @@
           <w:ilvl w:val="0"/>
           <w:numId w:val="2"/>
         </w:numPr>
-        <w:spacing w:before="13" w:after="13"/>
-      </w:pPr>
-      <w:r>
-        <w:rPr>
-          <w:rFonts w:ascii="Source Sans Pro" w:eastAsia="Source Sans Pro" w:hAnsi="Source Sans Pro" w:cs="Source Sans Pro"/>
-          <w:color w:val="000000"/>
-          <w:sz w:val="19"/>
-          <w:szCs w:val="19"/>
-        </w:rPr>
-        <w:t>Implemented transaction anomaly detection engine flagging structuring, rapid velocity, and dormant account reactivation patterns applicable to fraud and AML roles.</w:t>
+        <w:spacing w:before="13" w:after="34"/>
+      </w:pPr>
+      <w:r>
+        <w:rPr>
+          <w:rFonts w:ascii="Source Sans Pro" w:eastAsia="Source Sans Pro" w:hAnsi="Source Sans Pro" w:cs="Source Sans Pro"/>
+          <w:color w:val="000000"/>
+          <w:sz w:val="19"/>
+          <w:szCs w:val="19"/>
+        </w:rPr>
+        <w:t>CompTIA Security+ SY0-701  —  in progress, exam target Q3 2026</w:t>
       </w:r>
     </w:p>
     <w:p>
@@ -973,341 +910,7 @@
           <w:ilvl w:val="0"/>
           <w:numId w:val="2"/>
         </w:numPr>
-        <w:spacing w:before="13" w:after="13"/>
-      </w:pPr>
-      <w:r>
-        <w:rPr>
-          <w:rFonts w:ascii="Source Sans Pro" w:eastAsia="Source Sans Pro" w:hAnsi="Source Sans Pro" w:cs="Source Sans Pro"/>
-          <w:color w:val="000000"/>
-          <w:sz w:val="19"/>
-          <w:szCs w:val="19"/>
-        </w:rPr>
-        <w:t>Developed GDPR/PDPB audit checklist evaluating consent management, data minimisation, and breach notification compliance with scored outputs.</w:t>
-      </w:r>
-    </w:p>
-    <w:p>
-      <w:pPr>
-        <w:pBdr>
-          <w:bottom w:val="single" w:sz="6" w:space="1" w:color="000000"/>
-        </w:pBdr>
-        <w:spacing w:before="155" w:after="52"/>
-        <w:rPr>
-          <w:rFonts w:ascii="Source Sans Pro" w:eastAsia="Source Sans Pro" w:hAnsi="Source Sans Pro" w:cs="Source Sans Pro"/>
-          <w:b/>
-          <w:bCs/>
-          <w:color w:val="000000"/>
-          <w:sz w:val="22"/>
-          <w:szCs w:val="22"/>
-        </w:rPr>
-      </w:pPr>
-    </w:p>
-    <w:p>
-      <w:pPr>
-        <w:pBdr>
-          <w:bottom w:val="single" w:sz="6" w:space="1" w:color="000000"/>
-        </w:pBdr>
-        <w:spacing w:before="155" w:after="52"/>
-      </w:pPr>
-      <w:r>
-        <w:rPr>
-          <w:rFonts w:ascii="Source Sans Pro" w:eastAsia="Source Sans Pro" w:hAnsi="Source Sans Pro" w:cs="Source Sans Pro"/>
-          <w:b/>
-          <w:bCs/>
-          <w:color w:val="000000"/>
-          <w:sz w:val="22"/>
-          <w:szCs w:val="22"/>
-        </w:rPr>
-        <w:t>Technical Skills</w:t>
-      </w:r>
-    </w:p>
-    <w:p>
-      <w:pPr>
-        <w:spacing w:before="24" w:after="24"/>
-      </w:pPr>
-      <w:r>
-        <w:rPr>
-          <w:rFonts w:ascii="Source Sans Pro" w:eastAsia="Source Sans Pro" w:hAnsi="Source Sans Pro" w:cs="Source Sans Pro"/>
-          <w:b/>
-          <w:bCs/>
-          <w:color w:val="000000"/>
-          <w:sz w:val="19"/>
-          <w:szCs w:val="19"/>
-        </w:rPr>
-        <w:t>Networking:  TCP/IP, DNS, HTTP/S, firewall concepts, IDS/IPS concepts</w:t>
-      </w:r>
-      <w:r>
-        <w:rPr>
-          <w:rFonts w:ascii="Source Sans Pro" w:eastAsia="Source Sans Pro" w:hAnsi="Source Sans Pro" w:cs="Source Sans Pro"/>
-          <w:b/>
-          <w:bCs/>
-          <w:color w:val="000000"/>
-          <w:sz w:val="19"/>
-          <w:szCs w:val="19"/>
-        </w:rPr>
-      </w:r>
-      <w:r>
-        <w:rPr>
-          <w:rFonts w:ascii="Source Sans Pro" w:eastAsia="Source Sans Pro" w:hAnsi="Source Sans Pro" w:cs="Source Sans Pro"/>
-          <w:color w:val="000000"/>
-          <w:sz w:val="19"/>
-          <w:szCs w:val="19"/>
-        </w:rPr>
-      </w:r>
-    </w:p>
-    <w:p>
-      <w:pPr>
-        <w:spacing w:before="24" w:after="24"/>
-      </w:pPr>
-      <w:r>
-        <w:rPr>
-          <w:rFonts w:ascii="Source Sans Pro" w:eastAsia="Source Sans Pro" w:hAnsi="Source Sans Pro" w:cs="Source Sans Pro"/>
-          <w:b/>
-          <w:bCs/>
-          <w:color w:val="000000"/>
-          <w:sz w:val="19"/>
-          <w:szCs w:val="19"/>
-        </w:rPr>
-        <w:t>OS &amp; Scripting:  Linux (grep, netstat, log analysis), Windows internals, Active Directory (basics), PowerShell (basic), Python, Bash</w:t>
-      </w:r>
-      <w:r>
-        <w:rPr>
-          <w:rFonts w:ascii="Source Sans Pro" w:eastAsia="Source Sans Pro" w:hAnsi="Source Sans Pro" w:cs="Source Sans Pro"/>
-          <w:b/>
-          <w:bCs/>
-          <w:color w:val="000000"/>
-          <w:sz w:val="19"/>
-          <w:szCs w:val="19"/>
-        </w:rPr>
-      </w:r>
-      <w:r>
-        <w:rPr>
-          <w:rFonts w:ascii="Source Sans Pro" w:eastAsia="Source Sans Pro" w:hAnsi="Source Sans Pro" w:cs="Source Sans Pro"/>
-          <w:color w:val="000000"/>
-          <w:sz w:val="19"/>
-          <w:szCs w:val="19"/>
-        </w:rPr>
-      </w:r>
-    </w:p>
-    <w:p>
-      <w:pPr>
-        <w:spacing w:before="24" w:after="24"/>
-      </w:pPr>
-      <w:r>
-        <w:rPr>
-          <w:rFonts w:ascii="Source Sans Pro" w:eastAsia="Source Sans Pro" w:hAnsi="Source Sans Pro" w:cs="Source Sans Pro"/>
-          <w:b/>
-          <w:bCs/>
-          <w:color w:val="000000"/>
-          <w:sz w:val="19"/>
-          <w:szCs w:val="19"/>
-        </w:rPr>
-        <w:t>Risk &amp; Investigation:  Root cause analysis, policy-based case evaluation, audit documentation</w:t>
-      </w:r>
-      <w:r>
-        <w:rPr>
-          <w:rFonts w:ascii="Source Sans Pro" w:eastAsia="Source Sans Pro" w:hAnsi="Source Sans Pro" w:cs="Source Sans Pro"/>
-          <w:b/>
-          <w:bCs/>
-          <w:color w:val="000000"/>
-          <w:sz w:val="19"/>
-          <w:szCs w:val="19"/>
-        </w:rPr>
-      </w:r>
-      <w:r>
-        <w:rPr>
-          <w:rFonts w:ascii="Source Sans Pro" w:eastAsia="Source Sans Pro" w:hAnsi="Source Sans Pro" w:cs="Source Sans Pro"/>
-          <w:color w:val="000000"/>
-          <w:sz w:val="19"/>
-          <w:szCs w:val="19"/>
-        </w:rPr>
-      </w:r>
-    </w:p>
-    <w:p>
-      <w:pPr>
-        <w:spacing w:before="24" w:after="24"/>
-      </w:pPr>
-      <w:r>
-        <w:rPr>
-          <w:rFonts w:ascii="Source Sans Pro" w:eastAsia="Source Sans Pro" w:hAnsi="Source Sans Pro" w:cs="Source Sans Pro"/>
-          <w:b/>
-          <w:bCs/>
-          <w:color w:val="000000"/>
-          <w:sz w:val="19"/>
-          <w:szCs w:val="19"/>
-        </w:rPr>
-        <w:t>SIEM &amp; Tools:  Splunk (SPL), Wireshark, PCAP analysis, Windows Event Logs, Nmap</w:t>
-      </w:r>
-      <w:r>
-        <w:rPr>
-          <w:rFonts w:ascii="Source Sans Pro" w:eastAsia="Source Sans Pro" w:hAnsi="Source Sans Pro" w:cs="Source Sans Pro"/>
-          <w:b/>
-          <w:bCs/>
-          <w:color w:val="000000"/>
-          <w:sz w:val="19"/>
-          <w:szCs w:val="19"/>
-        </w:rPr>
-      </w:r>
-      <w:r>
-        <w:rPr>
-          <w:rFonts w:ascii="Source Sans Pro" w:eastAsia="Source Sans Pro" w:hAnsi="Source Sans Pro" w:cs="Source Sans Pro"/>
-          <w:color w:val="000000"/>
-          <w:sz w:val="19"/>
-          <w:szCs w:val="19"/>
-        </w:rPr>
-      </w:r>
-    </w:p>
-    <w:p>
-      <w:pPr>
-        <w:spacing w:before="24" w:after="24"/>
-      </w:pPr>
-      <w:r>
-        <w:rPr>
-          <w:rFonts w:ascii="Source Sans Pro" w:eastAsia="Source Sans Pro" w:hAnsi="Source Sans Pro" w:cs="Source Sans Pro"/>
-          <w:b/>
-          <w:bCs/>
-          <w:color w:val="000000"/>
-          <w:sz w:val="19"/>
-          <w:szCs w:val="19"/>
-        </w:rPr>
-        <w:t>Security Operations Center (SOC):  Alert triage, log analysis, security monitoring, threat detection, incident escalation, endpoint security, ticketing system workflows</w:t>
-      </w:r>
-      <w:proofErr w:type="spellStart"/>
-      <w:r>
-        <w:rPr>
-          <w:rFonts w:ascii="Source Sans Pro" w:eastAsia="Source Sans Pro" w:hAnsi="Source Sans Pro" w:cs="Source Sans Pro"/>
-          <w:b/>
-          <w:bCs/>
-          <w:color w:val="000000"/>
-          <w:sz w:val="19"/>
-          <w:szCs w:val="19"/>
-        </w:rPr>
-      </w:r>
-      <w:proofErr w:type="spellEnd"/>
-      <w:r>
-        <w:rPr>
-          <w:rFonts w:ascii="Source Sans Pro" w:eastAsia="Source Sans Pro" w:hAnsi="Source Sans Pro" w:cs="Source Sans Pro"/>
-          <w:b/>
-          <w:bCs/>
-          <w:color w:val="000000"/>
-          <w:sz w:val="19"/>
-          <w:szCs w:val="19"/>
-        </w:rPr>
-      </w:r>
-      <w:r>
-        <w:rPr>
-          <w:rFonts w:ascii="Source Sans Pro" w:eastAsia="Source Sans Pro" w:hAnsi="Source Sans Pro" w:cs="Source Sans Pro"/>
-          <w:b/>
-          <w:bCs/>
-          <w:color w:val="000000"/>
-          <w:sz w:val="19"/>
-          <w:szCs w:val="19"/>
-        </w:rPr>
-      </w:r>
-      <w:r>
-        <w:rPr>
-          <w:rFonts w:ascii="Source Sans Pro" w:eastAsia="Source Sans Pro" w:hAnsi="Source Sans Pro" w:cs="Source Sans Pro"/>
-          <w:color w:val="000000"/>
-          <w:sz w:val="19"/>
-          <w:szCs w:val="19"/>
-        </w:rPr>
-      </w:r>
-    </w:p>
-    <w:p>
-      <w:pPr>
-        <w:spacing w:before="24" w:after="24"/>
-      </w:pPr>
-      <w:r>
-        <w:rPr>
-          <w:rFonts w:ascii="Source Sans Pro" w:eastAsia="Source Sans Pro" w:hAnsi="Source Sans Pro" w:cs="Source Sans Pro"/>
-          <w:b/>
-          <w:bCs/>
-          <w:color w:val="000000"/>
-          <w:sz w:val="19"/>
-          <w:szCs w:val="19"/>
-        </w:rPr>
-        <w:t>Security Frameworks:  MITRE ATT&amp;CK, Incident Response (PICERL), OWASP Top 10</w:t>
-      </w:r>
-      <w:r>
-        <w:rPr>
-          <w:rFonts w:ascii="Source Sans Pro" w:eastAsia="Source Sans Pro" w:hAnsi="Source Sans Pro" w:cs="Source Sans Pro"/>
-          <w:b/>
-          <w:bCs/>
-          <w:color w:val="000000"/>
-          <w:sz w:val="19"/>
-          <w:szCs w:val="19"/>
-        </w:rPr>
-      </w:r>
-      <w:r>
-        <w:rPr>
-          <w:rFonts w:ascii="Source Sans Pro" w:eastAsia="Source Sans Pro" w:hAnsi="Source Sans Pro" w:cs="Source Sans Pro"/>
-          <w:color w:val="000000"/>
-          <w:sz w:val="19"/>
-          <w:szCs w:val="19"/>
-        </w:rPr>
-      </w:r>
-    </w:p>
-    <w:p>
-      <w:pPr>
-        <w:pBdr>
-          <w:bottom w:val="single" w:sz="6" w:space="1" w:color="000000"/>
-        </w:pBdr>
-        <w:spacing w:before="155" w:after="52"/>
-        <w:rPr>
-          <w:rFonts w:ascii="Source Sans Pro" w:eastAsia="Source Sans Pro" w:hAnsi="Source Sans Pro" w:cs="Source Sans Pro"/>
-          <w:b/>
-          <w:bCs/>
-          <w:color w:val="000000"/>
-          <w:sz w:val="22"/>
-          <w:szCs w:val="22"/>
-        </w:rPr>
-      </w:pPr>
-    </w:p>
-    <w:p>
-      <w:pPr>
-        <w:pBdr>
-          <w:bottom w:val="single" w:sz="6" w:space="1" w:color="000000"/>
-        </w:pBdr>
-        <w:spacing w:before="155" w:after="52"/>
-      </w:pPr>
-      <w:r>
-        <w:rPr>
-          <w:rFonts w:ascii="Source Sans Pro" w:eastAsia="Source Sans Pro" w:hAnsi="Source Sans Pro" w:cs="Source Sans Pro"/>
-          <w:b/>
-          <w:bCs/>
-          <w:color w:val="000000"/>
-          <w:sz w:val="22"/>
-          <w:szCs w:val="22"/>
-        </w:rPr>
-        <w:t>Certifications</w:t>
-      </w:r>
-    </w:p>
-    <w:p>
-      <w:pPr>
-        <w:pStyle w:val="ListParagraph"/>
-        <w:numPr>
-          <w:ilvl w:val="0"/>
-          <w:numId w:val="2"/>
-        </w:numPr>
-        <w:spacing w:before="13" w:after="13"/>
-      </w:pPr>
-      <w:r>
-        <w:rPr>
-          <w:rFonts w:ascii="Source Sans Pro" w:eastAsia="Source Sans Pro" w:hAnsi="Source Sans Pro" w:cs="Source Sans Pro"/>
-          <w:color w:val="000000"/>
-          <w:sz w:val="19"/>
-          <w:szCs w:val="19"/>
-        </w:rPr>
-        <w:t>CompTIA Security+ SY0-701  —  in progress, exam target Q3 2026</w:t>
-      </w:r>
-    </w:p>
-    <w:p>
-      <w:pPr>
-        <w:pStyle w:val="ListParagraph"/>
-        <w:numPr>
-          <w:ilvl w:val="0"/>
-          <w:numId w:val="2"/>
-        </w:numPr>
-        <w:spacing w:before="13" w:after="13"/>
+        <w:spacing w:before="13" w:after="34"/>
       </w:pPr>
       <w:r>
         <w:rPr>

</xml_diff>